<commit_message>
feat(demo): P23-T03 shared bank style manifest and generator support
Add deploy/demo-shared style manifest, DemoMasterDocxStyleSupport with POI assertions on credit-limit master, and 2.54cm margin baseline for demo masters.

Co-authored-by: Cursor <cursoragent@cursor.com>
</commit_message>
<xml_diff>
--- a/deploy/demo-credit-limit/assets/credit-limit-master.docx
+++ b/deploy/demo-credit-limit/assets/credit-limit-master.docx
@@ -45,10 +45,10 @@
       </w:r>
     </w:p>
     <w:sectPr>
-      <main:headerReference xmlns:main="http://schemas.openxmlformats.org/wordprocessingml/2006/main" xmlns:rel="http://schemas.openxmlformats.org/officeDocument/2006/relationships" main:type="default" rel:id="rId2"/>
-      <main:footerReference xmlns:main="http://schemas.openxmlformats.org/wordprocessingml/2006/main" xmlns:rel="http://schemas.openxmlformats.org/officeDocument/2006/relationships" main:type="default" rel:id="rId3"/>
+      <main:headerReference xmlns:main="http://schemas.openxmlformats.org/wordprocessingml/2006/main" xmlns:rel="http://schemas.openxmlformats.org/officeDocument/2006/relationships" main:type="default" rel:id="rId3"/>
+      <main:footerReference xmlns:main="http://schemas.openxmlformats.org/wordprocessingml/2006/main" xmlns:rel="http://schemas.openxmlformats.org/officeDocument/2006/relationships" main:type="default" rel:id="rId4"/>
       <main:pgSz xmlns:main="http://schemas.openxmlformats.org/wordprocessingml/2006/main" main:w="11906" main:h="16838"/>
-      <main:pgMar xmlns:main="http://schemas.openxmlformats.org/wordprocessingml/2006/main" main:top="1440" main:bottom="1440" main:left="1701" main:right="1276" main:header="708" main:footer="708" main:gutter="0"/>
+      <main:pgMar xmlns:main="http://schemas.openxmlformats.org/wordprocessingml/2006/main" main:top="1440" main:bottom="1440" main:left="1440" main:right="1440" main:header="708" main:footer="708" main:gutter="0"/>
     </w:sectPr>
   </w:body>
 </w:document>
@@ -204,7 +204,7 @@
         <w:sz w:val="22"/>
         <w:szCs w:val="22"/>
         <w:color w:val="000000"/>
-        <w:lang w:val="en-US"/>
+        <w:lang w:val="en-US" w:bidi="en-US"/>
       </w:rPr>
     </w:rPrDefault>
     <w:pPrDefault>
@@ -222,5 +222,75 @@
       <w:lang w:val="en-US"/>
     </w:rPr>
   </w:style>
+  <w:style w:type="paragraph" w:styleId="Heading1">
+    <w:name w:val="Heading1"/>
+    <w:qFormat/>
+    <w:rPr>
+      <w:sz w:val="32"/>
+      <w:rFonts w:ascii="Cambria" w:hAnsi="Cambria" w:cs="Cambria"/>
+      <w:b/>
+    </w:rPr>
+  </w:style>
+  <w:style w:type="paragraph" w:styleId="Heading2">
+    <w:name w:val="Heading2"/>
+    <w:qFormat/>
+    <w:rPr>
+      <w:sz w:val="28"/>
+      <w:rFonts w:ascii="Cambria" w:hAnsi="Cambria" w:cs="Cambria"/>
+      <w:b/>
+    </w:rPr>
+  </w:style>
+  <w:style w:type="paragraph" w:styleId="Heading3">
+    <w:name w:val="Heading3"/>
+    <w:qFormat/>
+    <w:rPr>
+      <w:sz w:val="24"/>
+      <w:rFonts w:ascii="Cambria" w:hAnsi="Cambria" w:cs="Cambria"/>
+      <w:b/>
+    </w:rPr>
+  </w:style>
+  <w:style w:type="paragraph" w:styleId="ClauseBody">
+    <w:name w:val="ClauseBody"/>
+    <w:qFormat/>
+    <w:rPr>
+      <w:sz w:val="20"/>
+      <w:rFonts w:ascii="Calibri" w:hAnsi="Calibri" w:cs="Calibri"/>
+    </w:rPr>
+  </w:style>
+  <w:style w:type="paragraph" w:styleId="DefinedTerm">
+    <w:name w:val="DefinedTerm"/>
+    <w:qFormat/>
+    <w:rPr>
+      <w:sz w:val="20"/>
+      <w:rFonts w:ascii="Calibri" w:hAnsi="Calibri" w:cs="Calibri"/>
+      <w:b/>
+    </w:rPr>
+  </w:style>
+  <w:style w:type="paragraph" w:styleId="TableHeader">
+    <w:name w:val="TableHeader"/>
+    <w:qFormat/>
+    <w:rPr>
+      <w:sz w:val="20"/>
+      <w:rFonts w:ascii="Calibri" w:hAnsi="Calibri" w:cs="Calibri"/>
+      <w:b/>
+    </w:rPr>
+  </w:style>
+  <w:style w:type="paragraph" w:styleId="ScheduleTitle">
+    <w:name w:val="ScheduleTitle"/>
+    <w:qFormat/>
+    <w:rPr>
+      <w:sz w:val="26"/>
+      <w:rFonts w:ascii="Cambria" w:hAnsi="Cambria" w:cs="Cambria"/>
+      <w:b/>
+    </w:rPr>
+  </w:style>
+  <w:style w:type="paragraph" w:styleId="SignatureBlock">
+    <w:name w:val="SignatureBlock"/>
+    <w:qFormat/>
+    <w:rPr>
+      <w:sz w:val="20"/>
+      <w:rFonts w:ascii="Calibri" w:hAnsi="Calibri" w:cs="Calibri"/>
+    </w:rPr>
+  </w:style>
 </w:styles>
 </file>
</xml_diff>

<commit_message>
feat(demo): P23-T04 bank-grade credit-limit confirmation rewrite
32 variables, nine anchors, rich structured bindings with styleRef and content modules; regenerated master DOCX and POI assertions green.

Co-authored-by: Cursor <cursoragent@cursor.com>
</commit_message>
<xml_diff>
--- a/deploy/demo-credit-limit/assets/credit-limit-master.docx
+++ b/deploy/demo-credit-limit/assets/credit-limit-master.docx
@@ -16,7 +16,7 @@
     </w:p>
     <w:p>
       <w:r>
-        <w:t>{{anchor:CREDIT_LIMIT_BODY}}</w:t>
+        <w:t>{{anchor:CL_PARTIES}}</w:t>
       </w:r>
     </w:p>
     <w:p>
@@ -29,19 +29,114 @@
     </w:p>
     <w:p>
       <w:pPr>
-        <w:jc w:val="center"/>
-      </w:pPr>
-      <w:r>
-        <w:rPr>
-          <w:b w:val="on"/>
-          <w:sz w:val="28"/>
-        </w:rPr>
-        <w:t>Facility Terms and Covenants</w:t>
-      </w:r>
-    </w:p>
-    <w:p>
-      <w:r>
-        <w:t>{{anchor:CREDIT_LIMIT_TERMS}}</w:t>
+        <w:jc w:val="left"/>
+      </w:pPr>
+      <w:r>
+        <w:rPr>
+          <w:b w:val="on"/>
+          <w:sz w:val="24"/>
+        </w:rPr>
+        <w:t>Defined Terms</w:t>
+      </w:r>
+    </w:p>
+    <w:p>
+      <w:r>
+        <w:t>{{anchor:CL_DEFINED_TERMS}}</w:t>
+      </w:r>
+    </w:p>
+    <w:p>
+      <w:pPr>
+        <w:sectPr>
+          <w:type w:val="nextPage"/>
+          <w:pgNumType w:start="1"/>
+        </w:sectPr>
+      </w:pPr>
+    </w:p>
+    <w:p>
+      <w:pPr>
+        <w:jc w:val="left"/>
+      </w:pPr>
+      <w:r>
+        <w:rPr>
+          <w:b w:val="on"/>
+          <w:sz w:val="24"/>
+        </w:rPr>
+        <w:t>Facility Terms</w:t>
+      </w:r>
+    </w:p>
+    <w:p>
+      <w:r>
+        <w:t>{{anchor:CL_FACILITY}}</w:t>
+      </w:r>
+    </w:p>
+    <w:p>
+      <w:r>
+        <w:t>{{anchor:CL_INTEREST}}</w:t>
+      </w:r>
+    </w:p>
+    <w:p>
+      <w:r>
+        <w:t>{{anchor:CL_COVENANTS}}</w:t>
+      </w:r>
+    </w:p>
+    <w:p>
+      <w:pPr>
+        <w:sectPr>
+          <w:type w:val="nextPage"/>
+          <w:pgNumType w:start="1"/>
+        </w:sectPr>
+      </w:pPr>
+    </w:p>
+    <w:p>
+      <w:pPr>
+        <w:jc w:val="left"/>
+      </w:pPr>
+      <w:r>
+        <w:rPr>
+          <w:b w:val="on"/>
+          <w:sz w:val="24"/>
+        </w:rPr>
+        <w:t>Schedules and Default</w:t>
+      </w:r>
+    </w:p>
+    <w:p>
+      <w:r>
+        <w:t>{{anchor:CL_REPAYMENT}}</w:t>
+      </w:r>
+    </w:p>
+    <w:p>
+      <w:r>
+        <w:t>{{anchor:CL_EOD}}</w:t>
+      </w:r>
+    </w:p>
+    <w:p>
+      <w:pPr>
+        <w:sectPr>
+          <w:type w:val="nextPage"/>
+          <w:pgNumType w:start="1"/>
+        </w:sectPr>
+      </w:pPr>
+    </w:p>
+    <w:p>
+      <w:pPr>
+        <w:jc w:val="left"/>
+      </w:pPr>
+      <w:r>
+        <w:rPr>
+          <w:b w:val="on"/>
+          <w:sz w:val="24"/>
+        </w:rPr>
+        <w:t>Closing Provisions</w:t>
+      </w:r>
+    </w:p>
+    <w:p>
+      <w:r>
+        <w:t>{{anchor:CL_GOVERNING_LAW}}</w:t>
+      </w:r>
+    </w:p>
+    <w:p>
+      <w:r>
+        <w:t>{{anchor:CL_SIGNATURE}}</w:t>
       </w:r>
     </w:p>
     <w:sectPr>

</xml_diff>